<commit_message>
feat: add exact GORELTECH group document templates
</commit_message>
<xml_diff>
--- a/supabase/functions/_shared/group-doc-templates/goreltech/class-journal/v1/template.docx
+++ b/supabase/functions/_shared/group-doc-templates/goreltech/class-journal/v1/template.docx
@@ -122,7 +122,8 @@
     </w:p>
     <w:tbl>
       <w:tblPr>
-        <w:tblW w:w="12420" w:type="dxa"/>
+        <w:tblInd w:w="0" w:type="dxa"/>
+        <w:tblW w:w="9300" w:type="dxa"/>
         <w:jc w:val="center"/>
         <w:tblBorders>
           <w:top w:val="single" w:sz="4" w:space="0" w:color="auto"/>
@@ -136,12 +137,12 @@
         <w:tblLook w:val="04A0" w:firstRow="1" w:lastRow="0" w:firstColumn="1" w:lastColumn="0" w:noHBand="0" w:noVBand="1"/>
       </w:tblPr>
       <w:tblGrid>
-        <w:gridCol w:w="1156"/>
-        <w:gridCol w:w="4912"/>
-        <w:gridCol w:w="1843"/>
-        <w:gridCol w:w="1589"/>
-        <w:gridCol w:w="1559"/>
-        <w:gridCol w:w="1361"/>
+        <w:gridCol w:w="866"/>
+        <w:gridCol w:w="3678"/>
+        <w:gridCol w:w="1380"/>
+        <w:gridCol w:w="1190"/>
+        <w:gridCol w:w="1167"/>
+        <w:gridCol w:w="1019"/>
       </w:tblGrid>
       <w:tr>
         <w:trPr>
@@ -150,7 +151,7 @@
         </w:trPr>
         <w:tc>
           <w:tcPr>
-            <w:tcW w:w="1156" w:type="dxa"/>
+            <w:tcW w:w="866" w:type="dxa"/>
             <w:vMerge w:val="restart"/>
             <w:vAlign w:val="center"/>
           </w:tcPr>
@@ -159,16 +160,16 @@
               <w:jc w:val="center"/>
               <w:rPr>
                 <w:b/>
-                <w:sz w:val="20"/>
-                <w:szCs w:val="20"/>
+                <w:sz w:val="15"/>
+                <w:szCs w:val="15"/>
               </w:rPr>
             </w:pPr>
             <w:proofErr w:type="spellStart"/>
             <w:r>
               <w:rPr>
                 <w:b/>
-                <w:sz w:val="20"/>
-                <w:szCs w:val="20"/>
+                <w:sz w:val="15"/>
+                <w:szCs w:val="15"/>
               </w:rPr>
               <w:t>пп</w:t>
             </w:r>
@@ -177,7 +178,7 @@
         </w:tc>
         <w:tc>
           <w:tcPr>
-            <w:tcW w:w="4912" w:type="dxa"/>
+            <w:tcW w:w="3678" w:type="dxa"/>
             <w:vMerge w:val="restart"/>
             <w:vAlign w:val="center"/>
           </w:tcPr>
@@ -186,15 +187,15 @@
               <w:jc w:val="center"/>
               <w:rPr>
                 <w:b/>
-                <w:sz w:val="20"/>
-                <w:szCs w:val="20"/>
-              </w:rPr>
-            </w:pPr>
-            <w:r>
-              <w:rPr>
-                <w:b/>
-                <w:sz w:val="20"/>
-                <w:szCs w:val="20"/>
+                <w:sz w:val="15"/>
+                <w:szCs w:val="15"/>
+              </w:rPr>
+            </w:pPr>
+            <w:r>
+              <w:rPr>
+                <w:b/>
+                <w:sz w:val="15"/>
+                <w:szCs w:val="15"/>
               </w:rPr>
               <w:t>Фамилия Имя Отчество</w:t>
             </w:r>
@@ -204,30 +205,30 @@
               <w:jc w:val="center"/>
               <w:rPr>
                 <w:b/>
-                <w:sz w:val="20"/>
-                <w:szCs w:val="20"/>
-              </w:rPr>
-            </w:pPr>
-          </w:p>
-        </w:tc>
-        <w:tc>
-          <w:tcPr>
-            <w:tcW w:w="1843" w:type="dxa"/>
-          </w:tcPr>
-          <w:p>
-            <w:pPr>
-              <w:jc w:val="center"/>
-              <w:rPr>
-                <w:b/>
-                <w:sz w:val="20"/>
-                <w:szCs w:val="20"/>
-              </w:rPr>
-            </w:pPr>
-            <w:r>
-              <w:rPr>
-                <w:b/>
-                <w:sz w:val="20"/>
-                <w:szCs w:val="20"/>
+                <w:sz w:val="15"/>
+                <w:szCs w:val="15"/>
+              </w:rPr>
+            </w:pPr>
+          </w:p>
+        </w:tc>
+        <w:tc>
+          <w:tcPr>
+            <w:tcW w:w="1380" w:type="dxa"/>
+          </w:tcPr>
+          <w:p>
+            <w:pPr>
+              <w:jc w:val="center"/>
+              <w:rPr>
+                <w:b/>
+                <w:sz w:val="15"/>
+                <w:szCs w:val="15"/>
+              </w:rPr>
+            </w:pPr>
+            <w:r>
+              <w:rPr>
+                <w:b/>
+                <w:sz w:val="15"/>
+                <w:szCs w:val="15"/>
               </w:rPr>
               <w:t>Дата и учет</w:t>
             </w:r>
@@ -235,22 +236,22 @@
         </w:tc>
         <w:tc>
           <w:tcPr>
-            <w:tcW w:w="1589" w:type="dxa"/>
-          </w:tcPr>
-          <w:p>
-            <w:pPr>
-              <w:jc w:val="center"/>
-              <w:rPr>
-                <w:b/>
-                <w:sz w:val="20"/>
-                <w:szCs w:val="20"/>
-              </w:rPr>
-            </w:pPr>
-            <w:r>
-              <w:rPr>
-                <w:b/>
-                <w:sz w:val="20"/>
-                <w:szCs w:val="20"/>
+            <w:tcW w:w="1190" w:type="dxa"/>
+          </w:tcPr>
+          <w:p>
+            <w:pPr>
+              <w:jc w:val="center"/>
+              <w:rPr>
+                <w:b/>
+                <w:sz w:val="15"/>
+                <w:szCs w:val="15"/>
+              </w:rPr>
+            </w:pPr>
+            <w:r>
+              <w:rPr>
+                <w:b/>
+                <w:sz w:val="15"/>
+                <w:szCs w:val="15"/>
               </w:rPr>
               <w:t>Дата и учет</w:t>
             </w:r>
@@ -258,22 +259,22 @@
         </w:tc>
         <w:tc>
           <w:tcPr>
-            <w:tcW w:w="1559" w:type="dxa"/>
-          </w:tcPr>
-          <w:p>
-            <w:pPr>
-              <w:jc w:val="center"/>
-              <w:rPr>
-                <w:b/>
-                <w:sz w:val="20"/>
-                <w:szCs w:val="20"/>
-              </w:rPr>
-            </w:pPr>
-            <w:r>
-              <w:rPr>
-                <w:b/>
-                <w:sz w:val="20"/>
-                <w:szCs w:val="20"/>
+            <w:tcW w:w="1167" w:type="dxa"/>
+          </w:tcPr>
+          <w:p>
+            <w:pPr>
+              <w:jc w:val="center"/>
+              <w:rPr>
+                <w:b/>
+                <w:sz w:val="15"/>
+                <w:szCs w:val="15"/>
+              </w:rPr>
+            </w:pPr>
+            <w:r>
+              <w:rPr>
+                <w:b/>
+                <w:sz w:val="15"/>
+                <w:szCs w:val="15"/>
               </w:rPr>
               <w:t>Дата и учет</w:t>
             </w:r>
@@ -281,22 +282,22 @@
         </w:tc>
         <w:tc>
           <w:tcPr>
-            <w:tcW w:w="1361" w:type="dxa"/>
-          </w:tcPr>
-          <w:p>
-            <w:pPr>
-              <w:jc w:val="center"/>
-              <w:rPr>
-                <w:b/>
-                <w:sz w:val="20"/>
-                <w:szCs w:val="20"/>
-              </w:rPr>
-            </w:pPr>
-            <w:r>
-              <w:rPr>
-                <w:b/>
-                <w:sz w:val="20"/>
-                <w:szCs w:val="20"/>
+            <w:tcW w:w="1019" w:type="dxa"/>
+          </w:tcPr>
+          <w:p>
+            <w:pPr>
+              <w:jc w:val="center"/>
+              <w:rPr>
+                <w:b/>
+                <w:sz w:val="15"/>
+                <w:szCs w:val="15"/>
+              </w:rPr>
+            </w:pPr>
+            <w:r>
+              <w:rPr>
+                <w:b/>
+                <w:sz w:val="15"/>
+                <w:szCs w:val="15"/>
               </w:rPr>
               <w:t>Дата и учет</w:t>
             </w:r>
@@ -310,7 +311,7 @@
         </w:trPr>
         <w:tc>
           <w:tcPr>
-            <w:tcW w:w="1156" w:type="dxa"/>
+            <w:tcW w:w="866" w:type="dxa"/>
             <w:vMerge/>
             <w:vAlign w:val="center"/>
           </w:tcPr>
@@ -319,15 +320,15 @@
               <w:jc w:val="center"/>
               <w:rPr>
                 <w:b/>
-                <w:sz w:val="20"/>
-                <w:szCs w:val="20"/>
-              </w:rPr>
-            </w:pPr>
-          </w:p>
-        </w:tc>
-        <w:tc>
-          <w:tcPr>
-            <w:tcW w:w="4912" w:type="dxa"/>
+                <w:sz w:val="15"/>
+                <w:szCs w:val="15"/>
+              </w:rPr>
+            </w:pPr>
+          </w:p>
+        </w:tc>
+        <w:tc>
+          <w:tcPr>
+            <w:tcW w:w="3678" w:type="dxa"/>
             <w:vMerge/>
             <w:vAlign w:val="center"/>
           </w:tcPr>
@@ -336,15 +337,15 @@
               <w:jc w:val="center"/>
               <w:rPr>
                 <w:b/>
-                <w:sz w:val="20"/>
-                <w:szCs w:val="20"/>
-              </w:rPr>
-            </w:pPr>
-          </w:p>
-        </w:tc>
-        <w:tc>
-          <w:tcPr>
-            <w:tcW w:w="1843" w:type="dxa"/>
+                <w:sz w:val="15"/>
+                <w:szCs w:val="15"/>
+              </w:rPr>
+            </w:pPr>
+          </w:p>
+        </w:tc>
+        <w:tc>
+          <w:tcPr>
+            <w:tcW w:w="1380" w:type="dxa"/>
             <w:vAlign w:val="center"/>
           </w:tcPr>
           <w:p>
@@ -352,47 +353,47 @@
               <w:jc w:val="center"/>
               <w:rPr>
                 <w:b/>
-                <w:sz w:val="22"/>
-                <w:szCs w:val="22"/>
-              </w:rPr>
-            </w:pPr>
-            <w:r>
-              <w:rPr>
-                <w:b/>
-                <w:sz w:val="22"/>
-                <w:szCs w:val="22"/>
+                <w:sz w:val="15"/>
+                <w:szCs w:val="15"/>
+              </w:rPr>
+            </w:pPr>
+            <w:r>
+              <w:rPr>
+                <w:b/>
+                <w:sz w:val="15"/>
+                <w:szCs w:val="15"/>
               </w:rPr>
               <w:t>[[DATE_1]]</w:t>
             </w:r>
             <w:r>
               <w:rPr>
                 <w:b/>
-                <w:sz w:val="22"/>
-                <w:szCs w:val="22"/>
+                <w:sz w:val="15"/>
+                <w:szCs w:val="15"/>
               </w:rPr>
               <w:t/>
             </w:r>
             <w:r>
               <w:rPr>
                 <w:b/>
-                <w:sz w:val="22"/>
-                <w:szCs w:val="22"/>
+                <w:sz w:val="15"/>
+                <w:szCs w:val="15"/>
               </w:rPr>
               <w:t/>
             </w:r>
             <w:r>
               <w:rPr>
                 <w:b/>
-                <w:sz w:val="22"/>
-                <w:szCs w:val="22"/>
+                <w:sz w:val="15"/>
+                <w:szCs w:val="15"/>
               </w:rPr>
               <w:t/>
             </w:r>
             <w:r>
               <w:rPr>
                 <w:b/>
-                <w:sz w:val="22"/>
-                <w:szCs w:val="22"/>
+                <w:sz w:val="15"/>
+                <w:szCs w:val="15"/>
               </w:rPr>
               <w:t/>
             </w:r>
@@ -400,54 +401,54 @@
         </w:tc>
         <w:tc>
           <w:tcPr>
-            <w:tcW w:w="1589" w:type="dxa"/>
+            <w:tcW w:w="1190" w:type="dxa"/>
             <w:vAlign w:val="center"/>
           </w:tcPr>
           <w:p>
             <w:pPr>
               <w:jc w:val="center"/>
               <w:rPr>
-                <w:sz w:val="22"/>
-                <w:szCs w:val="22"/>
-              </w:rPr>
-            </w:pPr>
-            <w:r>
-              <w:rPr>
-                <w:b/>
-                <w:sz w:val="22"/>
-                <w:szCs w:val="22"/>
+                <w:sz w:val="15"/>
+                <w:szCs w:val="15"/>
+              </w:rPr>
+            </w:pPr>
+            <w:r>
+              <w:rPr>
+                <w:b/>
+                <w:sz w:val="15"/>
+                <w:szCs w:val="15"/>
               </w:rPr>
               <w:t>[[DATE_2]]</w:t>
             </w:r>
             <w:r>
               <w:rPr>
                 <w:b/>
-                <w:sz w:val="22"/>
-                <w:szCs w:val="22"/>
+                <w:sz w:val="15"/>
+                <w:szCs w:val="15"/>
               </w:rPr>
               <w:t/>
             </w:r>
             <w:r>
               <w:rPr>
                 <w:b/>
-                <w:sz w:val="22"/>
-                <w:szCs w:val="22"/>
+                <w:sz w:val="15"/>
+                <w:szCs w:val="15"/>
               </w:rPr>
               <w:t/>
             </w:r>
             <w:r>
               <w:rPr>
                 <w:b/>
-                <w:sz w:val="22"/>
-                <w:szCs w:val="22"/>
+                <w:sz w:val="15"/>
+                <w:szCs w:val="15"/>
               </w:rPr>
               <w:t/>
             </w:r>
             <w:r>
               <w:rPr>
                 <w:b/>
-                <w:sz w:val="22"/>
-                <w:szCs w:val="22"/>
+                <w:sz w:val="15"/>
+                <w:szCs w:val="15"/>
               </w:rPr>
               <w:t/>
             </w:r>
@@ -455,54 +456,54 @@
         </w:tc>
         <w:tc>
           <w:tcPr>
-            <w:tcW w:w="1559" w:type="dxa"/>
+            <w:tcW w:w="1167" w:type="dxa"/>
             <w:vAlign w:val="center"/>
           </w:tcPr>
           <w:p>
             <w:pPr>
               <w:jc w:val="center"/>
               <w:rPr>
-                <w:sz w:val="22"/>
-                <w:szCs w:val="22"/>
-              </w:rPr>
-            </w:pPr>
-            <w:r>
-              <w:rPr>
-                <w:b/>
-                <w:sz w:val="22"/>
-                <w:szCs w:val="22"/>
+                <w:sz w:val="15"/>
+                <w:szCs w:val="15"/>
+              </w:rPr>
+            </w:pPr>
+            <w:r>
+              <w:rPr>
+                <w:b/>
+                <w:sz w:val="15"/>
+                <w:szCs w:val="15"/>
               </w:rPr>
               <w:t>[[DATE_3]]</w:t>
             </w:r>
             <w:r>
               <w:rPr>
                 <w:b/>
-                <w:sz w:val="22"/>
-                <w:szCs w:val="22"/>
+                <w:sz w:val="15"/>
+                <w:szCs w:val="15"/>
               </w:rPr>
               <w:t/>
             </w:r>
             <w:r>
               <w:rPr>
                 <w:b/>
-                <w:sz w:val="22"/>
-                <w:szCs w:val="22"/>
+                <w:sz w:val="15"/>
+                <w:szCs w:val="15"/>
               </w:rPr>
               <w:t/>
             </w:r>
             <w:r>
               <w:rPr>
                 <w:b/>
-                <w:sz w:val="22"/>
-                <w:szCs w:val="22"/>
+                <w:sz w:val="15"/>
+                <w:szCs w:val="15"/>
               </w:rPr>
               <w:t/>
             </w:r>
             <w:r>
               <w:rPr>
                 <w:b/>
-                <w:sz w:val="22"/>
-                <w:szCs w:val="22"/>
+                <w:sz w:val="15"/>
+                <w:szCs w:val="15"/>
               </w:rPr>
               <w:t/>
             </w:r>
@@ -510,54 +511,54 @@
         </w:tc>
         <w:tc>
           <w:tcPr>
-            <w:tcW w:w="1361" w:type="dxa"/>
+            <w:tcW w:w="1019" w:type="dxa"/>
             <w:vAlign w:val="center"/>
           </w:tcPr>
           <w:p>
             <w:pPr>
               <w:jc w:val="center"/>
               <w:rPr>
-                <w:sz w:val="22"/>
-                <w:szCs w:val="22"/>
-              </w:rPr>
-            </w:pPr>
-            <w:r>
-              <w:rPr>
-                <w:b/>
-                <w:sz w:val="22"/>
-                <w:szCs w:val="22"/>
+                <w:sz w:val="15"/>
+                <w:szCs w:val="15"/>
+              </w:rPr>
+            </w:pPr>
+            <w:r>
+              <w:rPr>
+                <w:b/>
+                <w:sz w:val="15"/>
+                <w:szCs w:val="15"/>
               </w:rPr>
               <w:t>[[DATE_4]]</w:t>
             </w:r>
             <w:r>
               <w:rPr>
                 <w:b/>
-                <w:sz w:val="22"/>
-                <w:szCs w:val="22"/>
+                <w:sz w:val="15"/>
+                <w:szCs w:val="15"/>
               </w:rPr>
               <w:t/>
             </w:r>
             <w:r>
               <w:rPr>
                 <w:b/>
-                <w:sz w:val="22"/>
-                <w:szCs w:val="22"/>
+                <w:sz w:val="15"/>
+                <w:szCs w:val="15"/>
               </w:rPr>
               <w:t/>
             </w:r>
             <w:r>
               <w:rPr>
                 <w:b/>
-                <w:sz w:val="22"/>
-                <w:szCs w:val="22"/>
+                <w:sz w:val="15"/>
+                <w:szCs w:val="15"/>
               </w:rPr>
               <w:t/>
             </w:r>
             <w:r>
               <w:rPr>
                 <w:b/>
-                <w:sz w:val="22"/>
-                <w:szCs w:val="22"/>
+                <w:sz w:val="15"/>
+                <w:szCs w:val="15"/>
               </w:rPr>
               <w:t/>
             </w:r>
@@ -571,21 +572,21 @@
         </w:trPr>
         <w:tc>
           <w:tcPr>
-            <w:tcW w:w="1156" w:type="dxa"/>
+            <w:tcW w:w="866" w:type="dxa"/>
             <w:vAlign w:val="center"/>
           </w:tcPr>
           <w:p>
             <w:pPr>
               <w:jc w:val="center"/>
               <w:rPr>
-                <w:sz w:val="20"/>
-                <w:szCs w:val="20"/>
-              </w:rPr>
-            </w:pPr>
-            <w:r>
-              <w:rPr>
-                <w:sz w:val="20"/>
-                <w:szCs w:val="20"/>
+                <w:sz w:val="15"/>
+                <w:szCs w:val="15"/>
+              </w:rPr>
+            </w:pPr>
+            <w:r>
+              <w:rPr>
+                <w:sz w:val="15"/>
+                <w:szCs w:val="15"/>
               </w:rPr>
               <w:t>[[N]]</w:t>
             </w:r>
@@ -593,7 +594,7 @@
         </w:tc>
         <w:tc>
           <w:tcPr>
-            <w:tcW w:w="4912" w:type="dxa"/>
+            <w:tcW w:w="3678" w:type="dxa"/>
           </w:tcPr>
           <w:p>
             <w:r>
@@ -603,22 +604,22 @@
         </w:tc>
         <w:tc>
           <w:tcPr>
-            <w:tcW w:w="1843" w:type="dxa"/>
-          </w:tcPr>
-          <w:p>
-            <w:pPr>
-              <w:jc w:val="center"/>
-              <w:rPr>
-                <w:sz w:val="20"/>
-                <w:szCs w:val="20"/>
+            <w:tcW w:w="1380" w:type="dxa"/>
+          </w:tcPr>
+          <w:p>
+            <w:pPr>
+              <w:jc w:val="center"/>
+              <w:rPr>
+                <w:sz w:val="15"/>
+                <w:szCs w:val="15"/>
                 <w:highlight w:val="yellow"/>
                 <w:lang w:val="en-US"/>
               </w:rPr>
             </w:pPr>
             <w:r>
               <w:rPr>
-                <w:sz w:val="20"/>
-                <w:szCs w:val="20"/>
+                <w:sz w:val="15"/>
+                <w:szCs w:val="15"/>
                 <w:lang w:val="en-US"/>
               </w:rPr>
               <w:t>[[MARK_1]]</w:t>
@@ -627,21 +628,21 @@
         </w:tc>
         <w:tc>
           <w:tcPr>
-            <w:tcW w:w="1589" w:type="dxa"/>
-          </w:tcPr>
-          <w:p>
-            <w:pPr>
-              <w:jc w:val="center"/>
-              <w:rPr>
-                <w:sz w:val="20"/>
-                <w:szCs w:val="20"/>
+            <w:tcW w:w="1190" w:type="dxa"/>
+          </w:tcPr>
+          <w:p>
+            <w:pPr>
+              <w:jc w:val="center"/>
+              <w:rPr>
+                <w:sz w:val="15"/>
+                <w:szCs w:val="15"/>
                 <w:highlight w:val="yellow"/>
               </w:rPr>
             </w:pPr>
             <w:r>
               <w:rPr>
-                <w:sz w:val="20"/>
-                <w:szCs w:val="20"/>
+                <w:sz w:val="15"/>
+                <w:szCs w:val="15"/>
                 <w:lang w:val="en-US"/>
               </w:rPr>
               <w:t>[[MARK_2]]</w:t>
@@ -650,21 +651,21 @@
         </w:tc>
         <w:tc>
           <w:tcPr>
-            <w:tcW w:w="1559" w:type="dxa"/>
-          </w:tcPr>
-          <w:p>
-            <w:pPr>
-              <w:jc w:val="center"/>
-              <w:rPr>
-                <w:sz w:val="20"/>
-                <w:szCs w:val="20"/>
+            <w:tcW w:w="1167" w:type="dxa"/>
+          </w:tcPr>
+          <w:p>
+            <w:pPr>
+              <w:jc w:val="center"/>
+              <w:rPr>
+                <w:sz w:val="15"/>
+                <w:szCs w:val="15"/>
                 <w:highlight w:val="yellow"/>
               </w:rPr>
             </w:pPr>
             <w:r>
               <w:rPr>
-                <w:sz w:val="20"/>
-                <w:szCs w:val="20"/>
+                <w:sz w:val="15"/>
+                <w:szCs w:val="15"/>
                 <w:lang w:val="en-US"/>
               </w:rPr>
               <w:t>[[MARK_3]]</w:t>
@@ -673,21 +674,21 @@
         </w:tc>
         <w:tc>
           <w:tcPr>
-            <w:tcW w:w="1361" w:type="dxa"/>
-          </w:tcPr>
-          <w:p>
-            <w:pPr>
-              <w:jc w:val="center"/>
-              <w:rPr>
-                <w:sz w:val="20"/>
-                <w:szCs w:val="20"/>
+            <w:tcW w:w="1019" w:type="dxa"/>
+          </w:tcPr>
+          <w:p>
+            <w:pPr>
+              <w:jc w:val="center"/>
+              <w:rPr>
+                <w:sz w:val="15"/>
+                <w:szCs w:val="15"/>
                 <w:highlight w:val="yellow"/>
               </w:rPr>
             </w:pPr>
             <w:r>
               <w:rPr>
-                <w:sz w:val="20"/>
-                <w:szCs w:val="20"/>
+                <w:sz w:val="15"/>
+                <w:szCs w:val="15"/>
                 <w:lang w:val="en-US"/>
               </w:rPr>
               <w:t>[[MARK_4]]</w:t>
@@ -702,21 +703,21 @@
         </w:trPr>
         <w:tc>
           <w:tcPr>
-            <w:tcW w:w="1156" w:type="dxa"/>
+            <w:tcW w:w="866" w:type="dxa"/>
             <w:vAlign w:val="center"/>
           </w:tcPr>
           <w:p>
             <w:pPr>
               <w:jc w:val="center"/>
               <w:rPr>
-                <w:sz w:val="20"/>
-                <w:szCs w:val="20"/>
-              </w:rPr>
-            </w:pPr>
-            <w:r>
-              <w:rPr>
-                <w:sz w:val="20"/>
-                <w:szCs w:val="20"/>
+                <w:sz w:val="15"/>
+                <w:szCs w:val="15"/>
+              </w:rPr>
+            </w:pPr>
+            <w:r>
+              <w:rPr>
+                <w:sz w:val="15"/>
+                <w:szCs w:val="15"/>
               </w:rPr>
               <w:t>2</w:t>
             </w:r>
@@ -724,7 +725,7 @@
         </w:tc>
         <w:tc>
           <w:tcPr>
-            <w:tcW w:w="4912" w:type="dxa"/>
+            <w:tcW w:w="3678" w:type="dxa"/>
           </w:tcPr>
           <w:p>
             <w:pPr>
@@ -734,8 +735,8 @@
               <w:rPr>
                 <w:rFonts w:eastAsiaTheme="minorHAnsi"/>
                 <w:color w:val="1A1A1A"/>
-                <w:sz w:val="20"/>
-                <w:szCs w:val="20"/>
+                <w:sz w:val="15"/>
+                <w:szCs w:val="15"/>
                 <w:lang w:eastAsia="en-US"/>
               </w:rPr>
             </w:pPr>
@@ -743,21 +744,21 @@
         </w:tc>
         <w:tc>
           <w:tcPr>
-            <w:tcW w:w="1843" w:type="dxa"/>
-          </w:tcPr>
-          <w:p>
-            <w:pPr>
-              <w:jc w:val="center"/>
-              <w:rPr>
-                <w:sz w:val="20"/>
-                <w:szCs w:val="20"/>
+            <w:tcW w:w="1380" w:type="dxa"/>
+          </w:tcPr>
+          <w:p>
+            <w:pPr>
+              <w:jc w:val="center"/>
+              <w:rPr>
+                <w:sz w:val="15"/>
+                <w:szCs w:val="15"/>
                 <w:highlight w:val="yellow"/>
               </w:rPr>
             </w:pPr>
             <w:r>
               <w:rPr>
-                <w:sz w:val="20"/>
-                <w:szCs w:val="20"/>
+                <w:sz w:val="15"/>
+                <w:szCs w:val="15"/>
                 <w:lang w:val="en-US"/>
               </w:rPr>
               <w:t>V</w:t>
@@ -766,21 +767,21 @@
         </w:tc>
         <w:tc>
           <w:tcPr>
-            <w:tcW w:w="1589" w:type="dxa"/>
-          </w:tcPr>
-          <w:p>
-            <w:pPr>
-              <w:jc w:val="center"/>
-              <w:rPr>
-                <w:sz w:val="20"/>
-                <w:szCs w:val="20"/>
+            <w:tcW w:w="1190" w:type="dxa"/>
+          </w:tcPr>
+          <w:p>
+            <w:pPr>
+              <w:jc w:val="center"/>
+              <w:rPr>
+                <w:sz w:val="15"/>
+                <w:szCs w:val="15"/>
                 <w:highlight w:val="yellow"/>
               </w:rPr>
             </w:pPr>
             <w:r>
               <w:rPr>
-                <w:sz w:val="20"/>
-                <w:szCs w:val="20"/>
+                <w:sz w:val="15"/>
+                <w:szCs w:val="15"/>
                 <w:lang w:val="en-US"/>
               </w:rPr>
               <w:t>V</w:t>
@@ -789,21 +790,21 @@
         </w:tc>
         <w:tc>
           <w:tcPr>
-            <w:tcW w:w="1559" w:type="dxa"/>
-          </w:tcPr>
-          <w:p>
-            <w:pPr>
-              <w:jc w:val="center"/>
-              <w:rPr>
-                <w:sz w:val="20"/>
-                <w:szCs w:val="20"/>
+            <w:tcW w:w="1167" w:type="dxa"/>
+          </w:tcPr>
+          <w:p>
+            <w:pPr>
+              <w:jc w:val="center"/>
+              <w:rPr>
+                <w:sz w:val="15"/>
+                <w:szCs w:val="15"/>
                 <w:highlight w:val="yellow"/>
               </w:rPr>
             </w:pPr>
             <w:r>
               <w:rPr>
-                <w:sz w:val="20"/>
-                <w:szCs w:val="20"/>
+                <w:sz w:val="15"/>
+                <w:szCs w:val="15"/>
                 <w:lang w:val="en-US"/>
               </w:rPr>
               <w:t>V</w:t>
@@ -812,21 +813,21 @@
         </w:tc>
         <w:tc>
           <w:tcPr>
-            <w:tcW w:w="1361" w:type="dxa"/>
-          </w:tcPr>
-          <w:p>
-            <w:pPr>
-              <w:jc w:val="center"/>
-              <w:rPr>
-                <w:sz w:val="20"/>
-                <w:szCs w:val="20"/>
+            <w:tcW w:w="1019" w:type="dxa"/>
+          </w:tcPr>
+          <w:p>
+            <w:pPr>
+              <w:jc w:val="center"/>
+              <w:rPr>
+                <w:sz w:val="15"/>
+                <w:szCs w:val="15"/>
                 <w:highlight w:val="yellow"/>
               </w:rPr>
             </w:pPr>
             <w:r>
               <w:rPr>
-                <w:sz w:val="20"/>
-                <w:szCs w:val="20"/>
+                <w:sz w:val="15"/>
+                <w:szCs w:val="15"/>
                 <w:lang w:val="en-US"/>
               </w:rPr>
               <w:t>V</w:t>
@@ -841,21 +842,21 @@
         </w:trPr>
         <w:tc>
           <w:tcPr>
-            <w:tcW w:w="1156" w:type="dxa"/>
+            <w:tcW w:w="866" w:type="dxa"/>
             <w:vAlign w:val="center"/>
           </w:tcPr>
           <w:p>
             <w:pPr>
               <w:jc w:val="center"/>
               <w:rPr>
-                <w:sz w:val="20"/>
-                <w:szCs w:val="20"/>
-              </w:rPr>
-            </w:pPr>
-            <w:r>
-              <w:rPr>
-                <w:sz w:val="20"/>
-                <w:szCs w:val="20"/>
+                <w:sz w:val="15"/>
+                <w:szCs w:val="15"/>
+              </w:rPr>
+            </w:pPr>
+            <w:r>
+              <w:rPr>
+                <w:sz w:val="15"/>
+                <w:szCs w:val="15"/>
               </w:rPr>
               <w:t>3</w:t>
             </w:r>
@@ -863,34 +864,34 @@
         </w:tc>
         <w:tc>
           <w:tcPr>
-            <w:tcW w:w="4912" w:type="dxa"/>
-          </w:tcPr>
-          <w:p>
-            <w:pPr>
-              <w:rPr>
-                <w:sz w:val="20"/>
-                <w:szCs w:val="20"/>
-              </w:rPr>
-            </w:pPr>
-          </w:p>
-        </w:tc>
-        <w:tc>
-          <w:tcPr>
-            <w:tcW w:w="1843" w:type="dxa"/>
-          </w:tcPr>
-          <w:p>
-            <w:pPr>
-              <w:jc w:val="center"/>
-              <w:rPr>
-                <w:sz w:val="20"/>
-                <w:szCs w:val="20"/>
+            <w:tcW w:w="3678" w:type="dxa"/>
+          </w:tcPr>
+          <w:p>
+            <w:pPr>
+              <w:rPr>
+                <w:sz w:val="15"/>
+                <w:szCs w:val="15"/>
+              </w:rPr>
+            </w:pPr>
+          </w:p>
+        </w:tc>
+        <w:tc>
+          <w:tcPr>
+            <w:tcW w:w="1380" w:type="dxa"/>
+          </w:tcPr>
+          <w:p>
+            <w:pPr>
+              <w:jc w:val="center"/>
+              <w:rPr>
+                <w:sz w:val="15"/>
+                <w:szCs w:val="15"/>
                 <w:highlight w:val="yellow"/>
               </w:rPr>
             </w:pPr>
             <w:r>
               <w:rPr>
-                <w:sz w:val="20"/>
-                <w:szCs w:val="20"/>
+                <w:sz w:val="15"/>
+                <w:szCs w:val="15"/>
                 <w:lang w:val="en-US"/>
               </w:rPr>
               <w:t>V</w:t>
@@ -899,21 +900,21 @@
         </w:tc>
         <w:tc>
           <w:tcPr>
-            <w:tcW w:w="1589" w:type="dxa"/>
-          </w:tcPr>
-          <w:p>
-            <w:pPr>
-              <w:jc w:val="center"/>
-              <w:rPr>
-                <w:sz w:val="20"/>
-                <w:szCs w:val="20"/>
+            <w:tcW w:w="1190" w:type="dxa"/>
+          </w:tcPr>
+          <w:p>
+            <w:pPr>
+              <w:jc w:val="center"/>
+              <w:rPr>
+                <w:sz w:val="15"/>
+                <w:szCs w:val="15"/>
                 <w:highlight w:val="yellow"/>
               </w:rPr>
             </w:pPr>
             <w:r>
               <w:rPr>
-                <w:sz w:val="20"/>
-                <w:szCs w:val="20"/>
+                <w:sz w:val="15"/>
+                <w:szCs w:val="15"/>
                 <w:lang w:val="en-US"/>
               </w:rPr>
               <w:t>V</w:t>
@@ -922,21 +923,21 @@
         </w:tc>
         <w:tc>
           <w:tcPr>
-            <w:tcW w:w="1559" w:type="dxa"/>
-          </w:tcPr>
-          <w:p>
-            <w:pPr>
-              <w:jc w:val="center"/>
-              <w:rPr>
-                <w:sz w:val="20"/>
-                <w:szCs w:val="20"/>
+            <w:tcW w:w="1167" w:type="dxa"/>
+          </w:tcPr>
+          <w:p>
+            <w:pPr>
+              <w:jc w:val="center"/>
+              <w:rPr>
+                <w:sz w:val="15"/>
+                <w:szCs w:val="15"/>
                 <w:highlight w:val="yellow"/>
               </w:rPr>
             </w:pPr>
             <w:r>
               <w:rPr>
-                <w:sz w:val="20"/>
-                <w:szCs w:val="20"/>
+                <w:sz w:val="15"/>
+                <w:szCs w:val="15"/>
                 <w:lang w:val="en-US"/>
               </w:rPr>
               <w:t>V</w:t>
@@ -945,21 +946,21 @@
         </w:tc>
         <w:tc>
           <w:tcPr>
-            <w:tcW w:w="1361" w:type="dxa"/>
-          </w:tcPr>
-          <w:p>
-            <w:pPr>
-              <w:jc w:val="center"/>
-              <w:rPr>
-                <w:sz w:val="20"/>
-                <w:szCs w:val="20"/>
+            <w:tcW w:w="1019" w:type="dxa"/>
+          </w:tcPr>
+          <w:p>
+            <w:pPr>
+              <w:jc w:val="center"/>
+              <w:rPr>
+                <w:sz w:val="15"/>
+                <w:szCs w:val="15"/>
                 <w:highlight w:val="yellow"/>
               </w:rPr>
             </w:pPr>
             <w:r>
               <w:rPr>
-                <w:sz w:val="20"/>
-                <w:szCs w:val="20"/>
+                <w:sz w:val="15"/>
+                <w:szCs w:val="15"/>
                 <w:lang w:val="en-US"/>
               </w:rPr>
               <w:t>V</w:t>
@@ -974,21 +975,21 @@
         </w:trPr>
         <w:tc>
           <w:tcPr>
-            <w:tcW w:w="1156" w:type="dxa"/>
+            <w:tcW w:w="866" w:type="dxa"/>
             <w:vAlign w:val="center"/>
           </w:tcPr>
           <w:p>
             <w:pPr>
               <w:jc w:val="center"/>
               <w:rPr>
-                <w:sz w:val="20"/>
-                <w:szCs w:val="20"/>
-              </w:rPr>
-            </w:pPr>
-            <w:r>
-              <w:rPr>
-                <w:sz w:val="20"/>
-                <w:szCs w:val="20"/>
+                <w:sz w:val="15"/>
+                <w:szCs w:val="15"/>
+              </w:rPr>
+            </w:pPr>
+            <w:r>
+              <w:rPr>
+                <w:sz w:val="15"/>
+                <w:szCs w:val="15"/>
               </w:rPr>
               <w:t>4</w:t>
             </w:r>
@@ -996,34 +997,34 @@
         </w:tc>
         <w:tc>
           <w:tcPr>
-            <w:tcW w:w="4912" w:type="dxa"/>
-          </w:tcPr>
-          <w:p>
-            <w:pPr>
-              <w:rPr>
-                <w:sz w:val="20"/>
-                <w:szCs w:val="20"/>
-              </w:rPr>
-            </w:pPr>
-          </w:p>
-        </w:tc>
-        <w:tc>
-          <w:tcPr>
-            <w:tcW w:w="1843" w:type="dxa"/>
-          </w:tcPr>
-          <w:p>
-            <w:pPr>
-              <w:jc w:val="center"/>
-              <w:rPr>
-                <w:sz w:val="20"/>
-                <w:szCs w:val="20"/>
+            <w:tcW w:w="3678" w:type="dxa"/>
+          </w:tcPr>
+          <w:p>
+            <w:pPr>
+              <w:rPr>
+                <w:sz w:val="15"/>
+                <w:szCs w:val="15"/>
+              </w:rPr>
+            </w:pPr>
+          </w:p>
+        </w:tc>
+        <w:tc>
+          <w:tcPr>
+            <w:tcW w:w="1380" w:type="dxa"/>
+          </w:tcPr>
+          <w:p>
+            <w:pPr>
+              <w:jc w:val="center"/>
+              <w:rPr>
+                <w:sz w:val="15"/>
+                <w:szCs w:val="15"/>
                 <w:highlight w:val="yellow"/>
               </w:rPr>
             </w:pPr>
             <w:r>
               <w:rPr>
-                <w:sz w:val="20"/>
-                <w:szCs w:val="20"/>
+                <w:sz w:val="15"/>
+                <w:szCs w:val="15"/>
                 <w:lang w:val="en-US"/>
               </w:rPr>
               <w:t>V</w:t>
@@ -1032,21 +1033,21 @@
         </w:tc>
         <w:tc>
           <w:tcPr>
-            <w:tcW w:w="1589" w:type="dxa"/>
-          </w:tcPr>
-          <w:p>
-            <w:pPr>
-              <w:jc w:val="center"/>
-              <w:rPr>
-                <w:sz w:val="20"/>
-                <w:szCs w:val="20"/>
+            <w:tcW w:w="1190" w:type="dxa"/>
+          </w:tcPr>
+          <w:p>
+            <w:pPr>
+              <w:jc w:val="center"/>
+              <w:rPr>
+                <w:sz w:val="15"/>
+                <w:szCs w:val="15"/>
                 <w:highlight w:val="yellow"/>
               </w:rPr>
             </w:pPr>
             <w:r>
               <w:rPr>
-                <w:sz w:val="20"/>
-                <w:szCs w:val="20"/>
+                <w:sz w:val="15"/>
+                <w:szCs w:val="15"/>
                 <w:lang w:val="en-US"/>
               </w:rPr>
               <w:t>V</w:t>
@@ -1055,21 +1056,21 @@
         </w:tc>
         <w:tc>
           <w:tcPr>
-            <w:tcW w:w="1559" w:type="dxa"/>
-          </w:tcPr>
-          <w:p>
-            <w:pPr>
-              <w:jc w:val="center"/>
-              <w:rPr>
-                <w:sz w:val="20"/>
-                <w:szCs w:val="20"/>
+            <w:tcW w:w="1167" w:type="dxa"/>
+          </w:tcPr>
+          <w:p>
+            <w:pPr>
+              <w:jc w:val="center"/>
+              <w:rPr>
+                <w:sz w:val="15"/>
+                <w:szCs w:val="15"/>
                 <w:highlight w:val="yellow"/>
               </w:rPr>
             </w:pPr>
             <w:r>
               <w:rPr>
-                <w:sz w:val="20"/>
-                <w:szCs w:val="20"/>
+                <w:sz w:val="15"/>
+                <w:szCs w:val="15"/>
                 <w:lang w:val="en-US"/>
               </w:rPr>
               <w:t>V</w:t>
@@ -1078,21 +1079,21 @@
         </w:tc>
         <w:tc>
           <w:tcPr>
-            <w:tcW w:w="1361" w:type="dxa"/>
-          </w:tcPr>
-          <w:p>
-            <w:pPr>
-              <w:jc w:val="center"/>
-              <w:rPr>
-                <w:sz w:val="20"/>
-                <w:szCs w:val="20"/>
+            <w:tcW w:w="1019" w:type="dxa"/>
+          </w:tcPr>
+          <w:p>
+            <w:pPr>
+              <w:jc w:val="center"/>
+              <w:rPr>
+                <w:sz w:val="15"/>
+                <w:szCs w:val="15"/>
                 <w:highlight w:val="yellow"/>
               </w:rPr>
             </w:pPr>
             <w:r>
               <w:rPr>
-                <w:sz w:val="20"/>
-                <w:szCs w:val="20"/>
+                <w:sz w:val="15"/>
+                <w:szCs w:val="15"/>
                 <w:lang w:val="en-US"/>
               </w:rPr>
               <w:t>V</w:t>
@@ -1107,21 +1108,21 @@
         </w:trPr>
         <w:tc>
           <w:tcPr>
-            <w:tcW w:w="1156" w:type="dxa"/>
+            <w:tcW w:w="866" w:type="dxa"/>
             <w:vAlign w:val="center"/>
           </w:tcPr>
           <w:p>
             <w:pPr>
               <w:jc w:val="center"/>
               <w:rPr>
-                <w:sz w:val="20"/>
-                <w:szCs w:val="20"/>
-              </w:rPr>
-            </w:pPr>
-            <w:r>
-              <w:rPr>
-                <w:sz w:val="20"/>
-                <w:szCs w:val="20"/>
+                <w:sz w:val="15"/>
+                <w:szCs w:val="15"/>
+              </w:rPr>
+            </w:pPr>
+            <w:r>
+              <w:rPr>
+                <w:sz w:val="15"/>
+                <w:szCs w:val="15"/>
               </w:rPr>
               <w:t>5</w:t>
             </w:r>
@@ -1129,34 +1130,34 @@
         </w:tc>
         <w:tc>
           <w:tcPr>
-            <w:tcW w:w="4912" w:type="dxa"/>
-          </w:tcPr>
-          <w:p>
-            <w:pPr>
-              <w:rPr>
-                <w:sz w:val="20"/>
-                <w:szCs w:val="20"/>
-              </w:rPr>
-            </w:pPr>
-          </w:p>
-        </w:tc>
-        <w:tc>
-          <w:tcPr>
-            <w:tcW w:w="1843" w:type="dxa"/>
-          </w:tcPr>
-          <w:p>
-            <w:pPr>
-              <w:jc w:val="center"/>
-              <w:rPr>
-                <w:sz w:val="20"/>
-                <w:szCs w:val="20"/>
-                <w:lang w:val="en-US"/>
-              </w:rPr>
-            </w:pPr>
-            <w:r>
-              <w:rPr>
-                <w:sz w:val="20"/>
-                <w:szCs w:val="20"/>
+            <w:tcW w:w="3678" w:type="dxa"/>
+          </w:tcPr>
+          <w:p>
+            <w:pPr>
+              <w:rPr>
+                <w:sz w:val="15"/>
+                <w:szCs w:val="15"/>
+              </w:rPr>
+            </w:pPr>
+          </w:p>
+        </w:tc>
+        <w:tc>
+          <w:tcPr>
+            <w:tcW w:w="1380" w:type="dxa"/>
+          </w:tcPr>
+          <w:p>
+            <w:pPr>
+              <w:jc w:val="center"/>
+              <w:rPr>
+                <w:sz w:val="15"/>
+                <w:szCs w:val="15"/>
+                <w:lang w:val="en-US"/>
+              </w:rPr>
+            </w:pPr>
+            <w:r>
+              <w:rPr>
+                <w:sz w:val="15"/>
+                <w:szCs w:val="15"/>
                 <w:lang w:val="en-US"/>
               </w:rPr>
               <w:t>V</w:t>
@@ -1165,21 +1166,21 @@
         </w:tc>
         <w:tc>
           <w:tcPr>
-            <w:tcW w:w="1589" w:type="dxa"/>
-          </w:tcPr>
-          <w:p>
-            <w:pPr>
-              <w:jc w:val="center"/>
-              <w:rPr>
-                <w:sz w:val="20"/>
-                <w:szCs w:val="20"/>
-                <w:lang w:val="en-US"/>
-              </w:rPr>
-            </w:pPr>
-            <w:r>
-              <w:rPr>
-                <w:sz w:val="20"/>
-                <w:szCs w:val="20"/>
+            <w:tcW w:w="1190" w:type="dxa"/>
+          </w:tcPr>
+          <w:p>
+            <w:pPr>
+              <w:jc w:val="center"/>
+              <w:rPr>
+                <w:sz w:val="15"/>
+                <w:szCs w:val="15"/>
+                <w:lang w:val="en-US"/>
+              </w:rPr>
+            </w:pPr>
+            <w:r>
+              <w:rPr>
+                <w:sz w:val="15"/>
+                <w:szCs w:val="15"/>
                 <w:lang w:val="en-US"/>
               </w:rPr>
               <w:t>V</w:t>
@@ -1188,21 +1189,21 @@
         </w:tc>
         <w:tc>
           <w:tcPr>
-            <w:tcW w:w="1559" w:type="dxa"/>
-          </w:tcPr>
-          <w:p>
-            <w:pPr>
-              <w:jc w:val="center"/>
-              <w:rPr>
-                <w:sz w:val="20"/>
-                <w:szCs w:val="20"/>
-                <w:lang w:val="en-US"/>
-              </w:rPr>
-            </w:pPr>
-            <w:r>
-              <w:rPr>
-                <w:sz w:val="20"/>
-                <w:szCs w:val="20"/>
+            <w:tcW w:w="1167" w:type="dxa"/>
+          </w:tcPr>
+          <w:p>
+            <w:pPr>
+              <w:jc w:val="center"/>
+              <w:rPr>
+                <w:sz w:val="15"/>
+                <w:szCs w:val="15"/>
+                <w:lang w:val="en-US"/>
+              </w:rPr>
+            </w:pPr>
+            <w:r>
+              <w:rPr>
+                <w:sz w:val="15"/>
+                <w:szCs w:val="15"/>
                 <w:lang w:val="en-US"/>
               </w:rPr>
               <w:t>V</w:t>
@@ -1211,21 +1212,21 @@
         </w:tc>
         <w:tc>
           <w:tcPr>
-            <w:tcW w:w="1361" w:type="dxa"/>
-          </w:tcPr>
-          <w:p>
-            <w:pPr>
-              <w:jc w:val="center"/>
-              <w:rPr>
-                <w:sz w:val="20"/>
-                <w:szCs w:val="20"/>
-                <w:lang w:val="en-US"/>
-              </w:rPr>
-            </w:pPr>
-            <w:r>
-              <w:rPr>
-                <w:sz w:val="20"/>
-                <w:szCs w:val="20"/>
+            <w:tcW w:w="1019" w:type="dxa"/>
+          </w:tcPr>
+          <w:p>
+            <w:pPr>
+              <w:jc w:val="center"/>
+              <w:rPr>
+                <w:sz w:val="15"/>
+                <w:szCs w:val="15"/>
+                <w:lang w:val="en-US"/>
+              </w:rPr>
+            </w:pPr>
+            <w:r>
+              <w:rPr>
+                <w:sz w:val="15"/>
+                <w:szCs w:val="15"/>
                 <w:lang w:val="en-US"/>
               </w:rPr>
               <w:t>V</w:t>
@@ -1240,21 +1241,21 @@
         </w:trPr>
         <w:tc>
           <w:tcPr>
-            <w:tcW w:w="1156" w:type="dxa"/>
+            <w:tcW w:w="866" w:type="dxa"/>
             <w:vAlign w:val="center"/>
           </w:tcPr>
           <w:p>
             <w:pPr>
               <w:jc w:val="center"/>
               <w:rPr>
-                <w:sz w:val="20"/>
-                <w:szCs w:val="20"/>
-              </w:rPr>
-            </w:pPr>
-            <w:r>
-              <w:rPr>
-                <w:sz w:val="20"/>
-                <w:szCs w:val="20"/>
+                <w:sz w:val="15"/>
+                <w:szCs w:val="15"/>
+              </w:rPr>
+            </w:pPr>
+            <w:r>
+              <w:rPr>
+                <w:sz w:val="15"/>
+                <w:szCs w:val="15"/>
               </w:rPr>
               <w:t>6</w:t>
             </w:r>
@@ -1262,34 +1263,34 @@
         </w:tc>
         <w:tc>
           <w:tcPr>
-            <w:tcW w:w="4912" w:type="dxa"/>
-          </w:tcPr>
-          <w:p>
-            <w:pPr>
-              <w:rPr>
-                <w:sz w:val="20"/>
-                <w:szCs w:val="20"/>
-              </w:rPr>
-            </w:pPr>
-          </w:p>
-        </w:tc>
-        <w:tc>
-          <w:tcPr>
-            <w:tcW w:w="1843" w:type="dxa"/>
-          </w:tcPr>
-          <w:p>
-            <w:pPr>
-              <w:jc w:val="center"/>
-              <w:rPr>
-                <w:sz w:val="20"/>
-                <w:szCs w:val="20"/>
-                <w:lang w:val="en-US"/>
-              </w:rPr>
-            </w:pPr>
-            <w:r>
-              <w:rPr>
-                <w:sz w:val="20"/>
-                <w:szCs w:val="20"/>
+            <w:tcW w:w="3678" w:type="dxa"/>
+          </w:tcPr>
+          <w:p>
+            <w:pPr>
+              <w:rPr>
+                <w:sz w:val="15"/>
+                <w:szCs w:val="15"/>
+              </w:rPr>
+            </w:pPr>
+          </w:p>
+        </w:tc>
+        <w:tc>
+          <w:tcPr>
+            <w:tcW w:w="1380" w:type="dxa"/>
+          </w:tcPr>
+          <w:p>
+            <w:pPr>
+              <w:jc w:val="center"/>
+              <w:rPr>
+                <w:sz w:val="15"/>
+                <w:szCs w:val="15"/>
+                <w:lang w:val="en-US"/>
+              </w:rPr>
+            </w:pPr>
+            <w:r>
+              <w:rPr>
+                <w:sz w:val="15"/>
+                <w:szCs w:val="15"/>
                 <w:lang w:val="en-US"/>
               </w:rPr>
               <w:t>V</w:t>
@@ -1298,21 +1299,21 @@
         </w:tc>
         <w:tc>
           <w:tcPr>
-            <w:tcW w:w="1589" w:type="dxa"/>
-          </w:tcPr>
-          <w:p>
-            <w:pPr>
-              <w:jc w:val="center"/>
-              <w:rPr>
-                <w:sz w:val="20"/>
-                <w:szCs w:val="20"/>
-                <w:lang w:val="en-US"/>
-              </w:rPr>
-            </w:pPr>
-            <w:r>
-              <w:rPr>
-                <w:sz w:val="20"/>
-                <w:szCs w:val="20"/>
+            <w:tcW w:w="1190" w:type="dxa"/>
+          </w:tcPr>
+          <w:p>
+            <w:pPr>
+              <w:jc w:val="center"/>
+              <w:rPr>
+                <w:sz w:val="15"/>
+                <w:szCs w:val="15"/>
+                <w:lang w:val="en-US"/>
+              </w:rPr>
+            </w:pPr>
+            <w:r>
+              <w:rPr>
+                <w:sz w:val="15"/>
+                <w:szCs w:val="15"/>
                 <w:lang w:val="en-US"/>
               </w:rPr>
               <w:t>V</w:t>
@@ -1321,21 +1322,21 @@
         </w:tc>
         <w:tc>
           <w:tcPr>
-            <w:tcW w:w="1559" w:type="dxa"/>
-          </w:tcPr>
-          <w:p>
-            <w:pPr>
-              <w:jc w:val="center"/>
-              <w:rPr>
-                <w:sz w:val="20"/>
-                <w:szCs w:val="20"/>
-                <w:lang w:val="en-US"/>
-              </w:rPr>
-            </w:pPr>
-            <w:r>
-              <w:rPr>
-                <w:sz w:val="20"/>
-                <w:szCs w:val="20"/>
+            <w:tcW w:w="1167" w:type="dxa"/>
+          </w:tcPr>
+          <w:p>
+            <w:pPr>
+              <w:jc w:val="center"/>
+              <w:rPr>
+                <w:sz w:val="15"/>
+                <w:szCs w:val="15"/>
+                <w:lang w:val="en-US"/>
+              </w:rPr>
+            </w:pPr>
+            <w:r>
+              <w:rPr>
+                <w:sz w:val="15"/>
+                <w:szCs w:val="15"/>
                 <w:lang w:val="en-US"/>
               </w:rPr>
               <w:t>V</w:t>
@@ -1344,21 +1345,21 @@
         </w:tc>
         <w:tc>
           <w:tcPr>
-            <w:tcW w:w="1361" w:type="dxa"/>
-          </w:tcPr>
-          <w:p>
-            <w:pPr>
-              <w:jc w:val="center"/>
-              <w:rPr>
-                <w:sz w:val="20"/>
-                <w:szCs w:val="20"/>
-                <w:lang w:val="en-US"/>
-              </w:rPr>
-            </w:pPr>
-            <w:r>
-              <w:rPr>
-                <w:sz w:val="20"/>
-                <w:szCs w:val="20"/>
+            <w:tcW w:w="1019" w:type="dxa"/>
+          </w:tcPr>
+          <w:p>
+            <w:pPr>
+              <w:jc w:val="center"/>
+              <w:rPr>
+                <w:sz w:val="15"/>
+                <w:szCs w:val="15"/>
+                <w:lang w:val="en-US"/>
+              </w:rPr>
+            </w:pPr>
+            <w:r>
+              <w:rPr>
+                <w:sz w:val="15"/>
+                <w:szCs w:val="15"/>
                 <w:lang w:val="en-US"/>
               </w:rPr>
               <w:t>V</w:t>
@@ -1410,42 +1411,42 @@
           <w:bCs/>
           <w:color w:val="000000"/>
         </w:rPr>
-        <w:t>Преподаватель</w:t>
+        <w:t>Преподаватели [[INSTRUCTOR_SHORT]] __________________________ Подпись __________________________</w:t>
       </w:r>
       <w:r>
         <w:rPr>
           <w:bCs/>
           <w:color w:val="000000"/>
         </w:rPr>
-        <w:t xml:space="preserve"> </w:t>
+        <w:t xml:space="preserve"/>
       </w:r>
       <w:r>
         <w:rPr>
           <w:bCs/>
           <w:color w:val="000000"/>
         </w:rPr>
-        <w:t>[[INSTRUCTOR_SHORT]]</w:t>
+        <w:t/>
       </w:r>
       <w:r>
         <w:rPr>
           <w:bCs/>
           <w:color w:val="000000"/>
         </w:rPr>
-        <w:t xml:space="preserve">                           </w:t>
+        <w:t xml:space="preserve"/>
       </w:r>
       <w:r>
         <w:rPr>
           <w:bCs/>
           <w:color w:val="000000"/>
         </w:rPr>
-        <w:t xml:space="preserve">                    </w:t>
+        <w:t xml:space="preserve"/>
       </w:r>
       <w:r>
         <w:rPr>
           <w:bCs/>
           <w:color w:val="000000"/>
         </w:rPr>
-        <w:t>Подпись______________________________</w:t>
+        <w:t/>
       </w:r>
     </w:p>
     <w:p>
@@ -1483,18 +1484,18 @@
         <w:rPr>
           <w:b/>
         </w:rPr>
-        <w:t xml:space="preserve"> </w:t>
+        <w:t xml:space="preserve">Генеральный директор [[DIRECTOR_SIGNATURE]] __________________________________________</w:t>
       </w:r>
       <w:r>
         <w:rPr>
           <w:b/>
         </w:rPr>
-        <w:t xml:space="preserve">Руководитель учебного центра   [[DIRECTOR_SIGNATURE]]    _____________________________________  </w:t>
+        <w:t xml:space="preserve"/>
       </w:r>
     </w:p>
     <w:sectPr>
       <w:headerReference w:type="default" r:id="rId7"/>
-      <w:pgSz w:w="16838" w:h="11906" w:orient="landscape" w:code="9"/>
+      <w:pgSz w:w="11906" w:h="16838" w:code="9"/>
       <w:pgMar w:top="709" w:right="1134" w:bottom="709" w:left="1134" w:header="567" w:footer="544" w:gutter="0"/>
       <w:cols w:space="708"/>
       <w:docGrid w:linePitch="360"/>

</xml_diff>

<commit_message>
fix: harden GORELTECH group DOCX package
</commit_message>
<xml_diff>
--- a/supabase/functions/_shared/group-doc-templates/goreltech/class-journal/v1/template.docx
+++ b/supabase/functions/_shared/group-doc-templates/goreltech/class-journal/v1/template.docx
@@ -101,13 +101,13 @@
         <w:rPr>
           <w:i/>
         </w:rPr>
-        <w:t>часов -</w:t>
+        <w:t>часов - [[PROGRAM_HOURS]]</w:t>
       </w:r>
       <w:r>
         <w:rPr>
           <w:i/>
         </w:rPr>
-        <w:t>[[PROGRAM_HOURS]]</w:t>
+        <w:t/>
       </w:r>
     </w:p>
     <w:p>
@@ -1484,7 +1484,7 @@
         <w:rPr>
           <w:b/>
         </w:rPr>
-        <w:t xml:space="preserve">Генеральный директор [[DIRECTOR_SIGNATURE]] __________________________________________</w:t>
+        <w:t xml:space="preserve">[[SIGNATORY_POSITION]] [[SIGNATORY_SHORT]] __________________________________________</w:t>
       </w:r>
       <w:r>
         <w:rPr>

</xml_diff>